<commit_message>
Ajout du rendu etc ... bref
</commit_message>
<xml_diff>
--- a/Revserse/examen/rendu/rendu.docx
+++ b/Revserse/examen/rendu/rendu.docx
@@ -6,12 +6,14 @@
       <w:pPr>
         <w:pStyle w:val="Heading1"/>
         <w:rPr>
+          <w:rFonts w:ascii="Arial" w:hAnsi="Arial" w:cs="Arial"/>
           <w:lang w:val="fr-FR"/>
         </w:rPr>
       </w:pPr>
       <w:bookmarkStart w:id="0" w:name="_Toc208483956"/>
       <w:r>
         <w:rPr>
+          <w:rFonts w:ascii="Arial" w:hAnsi="Arial" w:cs="Arial"/>
           <w:lang w:val="fr-FR"/>
         </w:rPr>
         <w:t>Rapport</w:t>
@@ -21,124 +23,1744 @@
     <w:p>
       <w:pPr>
         <w:pStyle w:val="TITREII"/>
+        <w:rPr>
+          <w:rFonts w:ascii="Arial" w:hAnsi="Arial" w:cs="Arial"/>
+        </w:rPr>
       </w:pPr>
       <w:bookmarkStart w:id="1" w:name="_Toc208483957"/>
       <w:r>
+        <w:rPr>
+          <w:rFonts w:ascii="Arial" w:hAnsi="Arial" w:cs="Arial"/>
+        </w:rPr>
         <w:t>Introduction</w:t>
       </w:r>
       <w:bookmarkEnd w:id="1"/>
     </w:p>
     <w:p>
-      <w:r>
-        <w:t>Présentation rapide du malware</w:t>
-      </w:r>
-    </w:p>
-    <w:p/>
+      <w:pPr>
+        <w:rPr>
+          <w:rFonts w:ascii="Arial" w:hAnsi="Arial" w:cs="Arial"/>
+        </w:rPr>
+      </w:pPr>
+      <w:r>
+        <w:rPr>
+          <w:rFonts w:ascii="Arial" w:hAnsi="Arial" w:cs="Arial"/>
+        </w:rPr>
+        <w:t>Ici le malware est un executable dans un fichier compressé 7z dont le mot de passe de décompression est : « MaCléWifiEstPourrie »</w:t>
+      </w:r>
+    </w:p>
+    <w:p>
+      <w:pPr>
+        <w:rPr>
+          <w:rFonts w:ascii="Arial" w:hAnsi="Arial" w:cs="Arial"/>
+        </w:rPr>
+      </w:pPr>
+      <w:r>
+        <w:rPr>
+          <w:rFonts w:ascii="Arial" w:hAnsi="Arial" w:cs="Arial"/>
+        </w:rPr>
+        <w:t xml:space="preserve">Après un file on peut voir qu’il a un header </w:t>
+      </w:r>
+      <w:r>
+        <w:rPr>
+          <w:rFonts w:ascii="Arial" w:hAnsi="Arial" w:cs="Arial"/>
+        </w:rPr>
+        <w:t>ELF</w:t>
+      </w:r>
+      <w:r>
+        <w:rPr>
+          <w:rFonts w:ascii="Arial" w:hAnsi="Arial" w:cs="Arial"/>
+        </w:rPr>
+        <w:t xml:space="preserve"> basique</w:t>
+      </w:r>
+      <w:r>
+        <w:rPr>
+          <w:rFonts w:ascii="Arial" w:hAnsi="Arial" w:cs="Arial"/>
+        </w:rPr>
+        <w:t xml:space="preserve"> avec les bibliothèques linkées statiquement.</w:t>
+      </w:r>
+    </w:p>
+    <w:p>
+      <w:pPr>
+        <w:rPr>
+          <w:rFonts w:ascii="Arial" w:hAnsi="Arial" w:cs="Arial"/>
+        </w:rPr>
+      </w:pPr>
+      <w:r>
+        <w:rPr>
+          <w:rFonts w:ascii="Arial" w:hAnsi="Arial" w:cs="Arial"/>
+          <w:noProof/>
+          <w14:ligatures w14:val="standardContextual"/>
+        </w:rPr>
+        <w:drawing>
+          <wp:inline distT="0" distB="0" distL="0" distR="0" wp14:anchorId="66FFCC09" wp14:editId="421DCFEE">
+            <wp:extent cx="6645910" cy="469900"/>
+            <wp:effectExtent l="0" t="0" r="2540" b="6350"/>
+            <wp:docPr id="42522585" name="Picture 1"/>
+            <wp:cNvGraphicFramePr>
+              <a:graphicFrameLocks xmlns:a="http://schemas.openxmlformats.org/drawingml/2006/main" noChangeAspect="1"/>
+            </wp:cNvGraphicFramePr>
+            <a:graphic xmlns:a="http://schemas.openxmlformats.org/drawingml/2006/main">
+              <a:graphicData uri="http://schemas.openxmlformats.org/drawingml/2006/picture">
+                <pic:pic xmlns:pic="http://schemas.openxmlformats.org/drawingml/2006/picture">
+                  <pic:nvPicPr>
+                    <pic:cNvPr id="42522585" name=""/>
+                    <pic:cNvPicPr/>
+                  </pic:nvPicPr>
+                  <pic:blipFill>
+                    <a:blip r:embed="rId5"/>
+                    <a:stretch>
+                      <a:fillRect/>
+                    </a:stretch>
+                  </pic:blipFill>
+                  <pic:spPr>
+                    <a:xfrm>
+                      <a:off x="0" y="0"/>
+                      <a:ext cx="6645910" cy="469900"/>
+                    </a:xfrm>
+                    <a:prstGeom prst="rect">
+                      <a:avLst/>
+                    </a:prstGeom>
+                  </pic:spPr>
+                </pic:pic>
+              </a:graphicData>
+            </a:graphic>
+          </wp:inline>
+        </w:drawing>
+      </w:r>
+    </w:p>
+    <w:p>
+      <w:pPr>
+        <w:rPr>
+          <w:rFonts w:ascii="Arial" w:hAnsi="Arial" w:cs="Arial"/>
+        </w:rPr>
+      </w:pPr>
+      <w:r>
+        <w:rPr>
+          <w:rFonts w:ascii="Arial" w:hAnsi="Arial" w:cs="Arial"/>
+        </w:rPr>
+        <w:t>Avec strings on peut voir qu’il</w:t>
+      </w:r>
+      <w:r>
+        <w:rPr>
+          <w:rFonts w:ascii="Arial" w:hAnsi="Arial" w:cs="Arial"/>
+        </w:rPr>
+        <w:t xml:space="preserve"> semble</w:t>
+      </w:r>
+      <w:r>
+        <w:rPr>
+          <w:rFonts w:ascii="Arial" w:hAnsi="Arial" w:cs="Arial"/>
+        </w:rPr>
+        <w:t xml:space="preserve"> </w:t>
+      </w:r>
+      <w:r>
+        <w:rPr>
+          <w:rFonts w:ascii="Arial" w:hAnsi="Arial" w:cs="Arial"/>
+        </w:rPr>
+        <w:t>être</w:t>
+      </w:r>
+      <w:r>
+        <w:rPr>
+          <w:rFonts w:ascii="Arial" w:hAnsi="Arial" w:cs="Arial"/>
+        </w:rPr>
+        <w:t xml:space="preserve"> packé avec </w:t>
+      </w:r>
+      <w:r>
+        <w:rPr>
+          <w:rFonts w:ascii="Arial" w:hAnsi="Arial" w:cs="Arial"/>
+        </w:rPr>
+        <w:t>UPX</w:t>
+      </w:r>
+      <w:r>
+        <w:rPr>
+          <w:rFonts w:ascii="Arial" w:hAnsi="Arial" w:cs="Arial"/>
+        </w:rPr>
+        <w:t> :</w:t>
+      </w:r>
+    </w:p>
+    <w:p>
+      <w:pPr>
+        <w:rPr>
+          <w:rFonts w:ascii="Arial" w:hAnsi="Arial" w:cs="Arial"/>
+        </w:rPr>
+      </w:pPr>
+      <w:r>
+        <w:rPr>
+          <w:rFonts w:ascii="Arial" w:hAnsi="Arial" w:cs="Arial"/>
+          <w:noProof/>
+          <w14:ligatures w14:val="standardContextual"/>
+        </w:rPr>
+        <w:drawing>
+          <wp:inline distT="0" distB="0" distL="0" distR="0" wp14:anchorId="516164CC" wp14:editId="2064D6F4">
+            <wp:extent cx="6629400" cy="581025"/>
+            <wp:effectExtent l="0" t="0" r="0" b="9525"/>
+            <wp:docPr id="692506121" name="Picture 1"/>
+            <wp:cNvGraphicFramePr>
+              <a:graphicFrameLocks xmlns:a="http://schemas.openxmlformats.org/drawingml/2006/main" noChangeAspect="1"/>
+            </wp:cNvGraphicFramePr>
+            <a:graphic xmlns:a="http://schemas.openxmlformats.org/drawingml/2006/main">
+              <a:graphicData uri="http://schemas.openxmlformats.org/drawingml/2006/picture">
+                <pic:pic xmlns:pic="http://schemas.openxmlformats.org/drawingml/2006/picture">
+                  <pic:nvPicPr>
+                    <pic:cNvPr id="692506121" name=""/>
+                    <pic:cNvPicPr/>
+                  </pic:nvPicPr>
+                  <pic:blipFill>
+                    <a:blip r:embed="rId6"/>
+                    <a:stretch>
+                      <a:fillRect/>
+                    </a:stretch>
+                  </pic:blipFill>
+                  <pic:spPr>
+                    <a:xfrm>
+                      <a:off x="0" y="0"/>
+                      <a:ext cx="6629400" cy="581025"/>
+                    </a:xfrm>
+                    <a:prstGeom prst="rect">
+                      <a:avLst/>
+                    </a:prstGeom>
+                  </pic:spPr>
+                </pic:pic>
+              </a:graphicData>
+            </a:graphic>
+          </wp:inline>
+        </w:drawing>
+      </w:r>
+    </w:p>
+    <w:p>
+      <w:pPr>
+        <w:rPr>
+          <w:rFonts w:ascii="Arial" w:hAnsi="Arial" w:cs="Arial"/>
+        </w:rPr>
+      </w:pPr>
+      <w:r>
+        <w:rPr>
+          <w:rFonts w:ascii="Arial" w:hAnsi="Arial" w:cs="Arial"/>
+        </w:rPr>
+        <w:t>On le dépack :</w:t>
+      </w:r>
+    </w:p>
+    <w:p>
+      <w:pPr>
+        <w:rPr>
+          <w:rFonts w:ascii="Arial" w:hAnsi="Arial" w:cs="Arial"/>
+        </w:rPr>
+      </w:pPr>
+      <w:r>
+        <w:rPr>
+          <w:rFonts w:ascii="Arial" w:hAnsi="Arial" w:cs="Arial"/>
+          <w:noProof/>
+          <w14:ligatures w14:val="standardContextual"/>
+        </w:rPr>
+        <w:drawing>
+          <wp:inline distT="0" distB="0" distL="0" distR="0" wp14:anchorId="13F159C4" wp14:editId="2D0D7C96">
+            <wp:extent cx="6600825" cy="1733550"/>
+            <wp:effectExtent l="0" t="0" r="9525" b="0"/>
+            <wp:docPr id="1891888858" name="Picture 1"/>
+            <wp:cNvGraphicFramePr>
+              <a:graphicFrameLocks xmlns:a="http://schemas.openxmlformats.org/drawingml/2006/main" noChangeAspect="1"/>
+            </wp:cNvGraphicFramePr>
+            <a:graphic xmlns:a="http://schemas.openxmlformats.org/drawingml/2006/main">
+              <a:graphicData uri="http://schemas.openxmlformats.org/drawingml/2006/picture">
+                <pic:pic xmlns:pic="http://schemas.openxmlformats.org/drawingml/2006/picture">
+                  <pic:nvPicPr>
+                    <pic:cNvPr id="1891888858" name=""/>
+                    <pic:cNvPicPr/>
+                  </pic:nvPicPr>
+                  <pic:blipFill>
+                    <a:blip r:embed="rId7"/>
+                    <a:stretch>
+                      <a:fillRect/>
+                    </a:stretch>
+                  </pic:blipFill>
+                  <pic:spPr>
+                    <a:xfrm>
+                      <a:off x="0" y="0"/>
+                      <a:ext cx="6600825" cy="1733550"/>
+                    </a:xfrm>
+                    <a:prstGeom prst="rect">
+                      <a:avLst/>
+                    </a:prstGeom>
+                  </pic:spPr>
+                </pic:pic>
+              </a:graphicData>
+            </a:graphic>
+          </wp:inline>
+        </w:drawing>
+      </w:r>
+    </w:p>
+    <w:p>
+      <w:pPr>
+        <w:rPr>
+          <w:rFonts w:ascii="Arial" w:hAnsi="Arial" w:cs="Arial"/>
+        </w:rPr>
+      </w:pPr>
+      <w:r>
+        <w:rPr>
+          <w:rFonts w:ascii="Arial" w:hAnsi="Arial" w:cs="Arial"/>
+        </w:rPr>
+        <w:t xml:space="preserve">On arrive bien à le dépacker avec </w:t>
+      </w:r>
+      <w:r>
+        <w:rPr>
+          <w:rFonts w:ascii="Arial" w:hAnsi="Arial" w:cs="Arial"/>
+        </w:rPr>
+        <w:t>UPX</w:t>
+      </w:r>
+      <w:r>
+        <w:rPr>
+          <w:rFonts w:ascii="Arial" w:hAnsi="Arial" w:cs="Arial"/>
+        </w:rPr>
+        <w:t xml:space="preserve"> on peut donc maintenant passer à l’analyse statique.</w:t>
+      </w:r>
+    </w:p>
     <w:p>
       <w:pPr>
         <w:pStyle w:val="TITREII"/>
-      </w:pPr>
-      <w:r>
+        <w:rPr>
+          <w:rFonts w:ascii="Arial" w:hAnsi="Arial" w:cs="Arial"/>
+        </w:rPr>
+      </w:pPr>
+      <w:r>
+        <w:rPr>
+          <w:rFonts w:ascii="Arial" w:hAnsi="Arial" w:cs="Arial"/>
+        </w:rPr>
         <w:t>Analyse du malware</w:t>
       </w:r>
     </w:p>
     <w:p>
       <w:pPr>
         <w:pStyle w:val="TITREIII"/>
-      </w:pPr>
-      <w:r>
+        <w:rPr>
+          <w:rFonts w:ascii="Arial" w:hAnsi="Arial" w:cs="Arial"/>
+        </w:rPr>
+      </w:pPr>
+      <w:r>
+        <w:rPr>
+          <w:rFonts w:ascii="Arial" w:hAnsi="Arial" w:cs="Arial"/>
+        </w:rPr>
         <w:t>Analyse statique</w:t>
       </w:r>
     </w:p>
     <w:p>
-      <w:r>
+      <w:pPr>
+        <w:rPr>
+          <w:rFonts w:ascii="Arial" w:hAnsi="Arial" w:cs="Arial"/>
+        </w:rPr>
+      </w:pPr>
+      <w:r>
+        <w:rPr>
+          <w:rFonts w:ascii="Arial" w:hAnsi="Arial" w:cs="Arial"/>
+        </w:rPr>
         <w:t>Protections, contournements, éléments statiques, strings du binaire, etc.</w:t>
       </w:r>
     </w:p>
     <w:p>
       <w:pPr>
+        <w:rPr>
+          <w:rFonts w:ascii="Arial" w:hAnsi="Arial" w:cs="Arial"/>
+        </w:rPr>
+      </w:pPr>
+      <w:r>
+        <w:rPr>
+          <w:rFonts w:ascii="Arial" w:hAnsi="Arial" w:cs="Arial"/>
+        </w:rPr>
+        <w:t>On fait une première passe sur ghidra</w:t>
+      </w:r>
+      <w:r>
+        <w:rPr>
+          <w:rFonts w:ascii="Arial" w:hAnsi="Arial" w:cs="Arial"/>
+        </w:rPr>
+        <w:t xml:space="preserve"> avec l’analyse. </w:t>
+      </w:r>
+    </w:p>
+    <w:p>
+      <w:pPr>
+        <w:rPr>
+          <w:rFonts w:ascii="Arial" w:hAnsi="Arial" w:cs="Arial"/>
+        </w:rPr>
+      </w:pPr>
+      <w:r>
+        <w:rPr>
+          <w:rFonts w:ascii="Arial" w:hAnsi="Arial" w:cs="Arial"/>
+        </w:rPr>
+        <w:t>Le malware se veut anti-debug avec des techniques comme</w:t>
+      </w:r>
+      <w:r>
+        <w:rPr>
+          <w:rFonts w:ascii="Arial" w:hAnsi="Arial" w:cs="Arial"/>
+        </w:rPr>
+        <w:t xml:space="preserve"> ptrace et des checks de variables d’environnement </w:t>
+      </w:r>
+      <w:r>
+        <w:rPr>
+          <w:rFonts w:ascii="Arial" w:hAnsi="Arial" w:cs="Arial"/>
+        </w:rPr>
+        <w:t xml:space="preserve">: </w:t>
+      </w:r>
+    </w:p>
+    <w:p>
+      <w:pPr>
+        <w:rPr>
+          <w:rFonts w:ascii="Arial" w:hAnsi="Arial" w:cs="Arial"/>
+        </w:rPr>
+      </w:pPr>
+      <w:r>
+        <w:rPr>
+          <w:rFonts w:ascii="Arial" w:hAnsi="Arial" w:cs="Arial"/>
+          <w:noProof/>
+          <w14:ligatures w14:val="standardContextual"/>
+        </w:rPr>
+        <w:drawing>
+          <wp:inline distT="0" distB="0" distL="0" distR="0" wp14:anchorId="795E8684" wp14:editId="677F9A9F">
+            <wp:extent cx="6645910" cy="426085"/>
+            <wp:effectExtent l="0" t="0" r="2540" b="0"/>
+            <wp:docPr id="304736292" name="Picture 1"/>
+            <wp:cNvGraphicFramePr>
+              <a:graphicFrameLocks xmlns:a="http://schemas.openxmlformats.org/drawingml/2006/main" noChangeAspect="1"/>
+            </wp:cNvGraphicFramePr>
+            <a:graphic xmlns:a="http://schemas.openxmlformats.org/drawingml/2006/main">
+              <a:graphicData uri="http://schemas.openxmlformats.org/drawingml/2006/picture">
+                <pic:pic xmlns:pic="http://schemas.openxmlformats.org/drawingml/2006/picture">
+                  <pic:nvPicPr>
+                    <pic:cNvPr id="304736292" name=""/>
+                    <pic:cNvPicPr/>
+                  </pic:nvPicPr>
+                  <pic:blipFill>
+                    <a:blip r:embed="rId8"/>
+                    <a:stretch>
+                      <a:fillRect/>
+                    </a:stretch>
+                  </pic:blipFill>
+                  <pic:spPr>
+                    <a:xfrm>
+                      <a:off x="0" y="0"/>
+                      <a:ext cx="6645910" cy="426085"/>
+                    </a:xfrm>
+                    <a:prstGeom prst="rect">
+                      <a:avLst/>
+                    </a:prstGeom>
+                  </pic:spPr>
+                </pic:pic>
+              </a:graphicData>
+            </a:graphic>
+          </wp:inline>
+        </w:drawing>
+      </w:r>
+    </w:p>
+    <w:p>
+      <w:pPr>
+        <w:rPr>
+          <w:rFonts w:ascii="Arial" w:hAnsi="Arial" w:cs="Arial"/>
+        </w:rPr>
+      </w:pPr>
+      <w:r>
+        <w:rPr>
+          <w:rFonts w:ascii="Arial" w:hAnsi="Arial" w:cs="Arial"/>
+        </w:rPr>
+        <w:t>Après contournement de cette condition</w:t>
+      </w:r>
+      <w:r>
+        <w:rPr>
+          <w:rFonts w:ascii="Arial" w:hAnsi="Arial" w:cs="Arial"/>
+        </w:rPr>
+        <w:t xml:space="preserve"> en changeant la condition d’un JZ par un JNZ</w:t>
+      </w:r>
+      <w:r>
+        <w:rPr>
+          <w:rFonts w:ascii="Arial" w:hAnsi="Arial" w:cs="Arial"/>
+        </w:rPr>
+        <w:t xml:space="preserve"> je peux analyser plus loin</w:t>
+      </w:r>
+      <w:r>
+        <w:rPr>
+          <w:rFonts w:ascii="Arial" w:hAnsi="Arial" w:cs="Arial"/>
+        </w:rPr>
+        <w:t>.</w:t>
+      </w:r>
+    </w:p>
+    <w:p>
+      <w:pPr>
+        <w:rPr>
+          <w:rFonts w:ascii="Arial" w:hAnsi="Arial" w:cs="Arial"/>
+        </w:rPr>
+      </w:pPr>
+      <w:r>
+        <w:rPr>
+          <w:rFonts w:ascii="Arial" w:hAnsi="Arial" w:cs="Arial"/>
+        </w:rPr>
+        <w:t>A partir de maintenant, les conditions non remplies impliquent une fermeture du programme avec une variable mise à 4 et retournée.</w:t>
+      </w:r>
+    </w:p>
+    <w:p>
+      <w:pPr>
+        <w:rPr>
+          <w:rFonts w:ascii="Arial" w:hAnsi="Arial" w:cs="Arial"/>
+        </w:rPr>
+      </w:pPr>
+      <w:r>
+        <w:rPr>
+          <w:rFonts w:ascii="Arial" w:hAnsi="Arial" w:cs="Arial"/>
+        </w:rPr>
+        <w:t xml:space="preserve">On voit plus tard que le programme garde des « timestamps » a une intervalle de 0,03 secondes : </w:t>
+      </w:r>
+    </w:p>
+    <w:p>
+      <w:pPr>
+        <w:rPr>
+          <w:rFonts w:ascii="Arial" w:hAnsi="Arial" w:cs="Arial"/>
+        </w:rPr>
+      </w:pPr>
+      <w:r>
+        <w:rPr>
+          <w:rFonts w:ascii="Arial" w:hAnsi="Arial" w:cs="Arial"/>
+          <w:noProof/>
+          <w14:ligatures w14:val="standardContextual"/>
+        </w:rPr>
+        <w:lastRenderedPageBreak/>
+        <w:drawing>
+          <wp:inline distT="0" distB="0" distL="0" distR="0" wp14:anchorId="3FA7FCF8" wp14:editId="2AA09E2C">
+            <wp:extent cx="4086225" cy="1571625"/>
+            <wp:effectExtent l="0" t="0" r="9525" b="9525"/>
+            <wp:docPr id="688788036" name="Picture 1"/>
+            <wp:cNvGraphicFramePr>
+              <a:graphicFrameLocks xmlns:a="http://schemas.openxmlformats.org/drawingml/2006/main" noChangeAspect="1"/>
+            </wp:cNvGraphicFramePr>
+            <a:graphic xmlns:a="http://schemas.openxmlformats.org/drawingml/2006/main">
+              <a:graphicData uri="http://schemas.openxmlformats.org/drawingml/2006/picture">
+                <pic:pic xmlns:pic="http://schemas.openxmlformats.org/drawingml/2006/picture">
+                  <pic:nvPicPr>
+                    <pic:cNvPr id="688788036" name=""/>
+                    <pic:cNvPicPr/>
+                  </pic:nvPicPr>
+                  <pic:blipFill>
+                    <a:blip r:embed="rId9"/>
+                    <a:stretch>
+                      <a:fillRect/>
+                    </a:stretch>
+                  </pic:blipFill>
+                  <pic:spPr>
+                    <a:xfrm>
+                      <a:off x="0" y="0"/>
+                      <a:ext cx="4086225" cy="1571625"/>
+                    </a:xfrm>
+                    <a:prstGeom prst="rect">
+                      <a:avLst/>
+                    </a:prstGeom>
+                  </pic:spPr>
+                </pic:pic>
+              </a:graphicData>
+            </a:graphic>
+          </wp:inline>
+        </w:drawing>
+      </w:r>
+    </w:p>
+    <w:p>
+      <w:pPr>
+        <w:rPr>
+          <w:rFonts w:ascii="Arial" w:hAnsi="Arial" w:cs="Arial"/>
+        </w:rPr>
+      </w:pPr>
+      <w:r>
+        <w:rPr>
+          <w:rFonts w:ascii="Arial" w:hAnsi="Arial" w:cs="Arial"/>
+        </w:rPr>
+        <w:t xml:space="preserve">L’intervalle des timestamps est définit par la variable local_68 et la fonction clock_gettime permet d’insérer le temp actuel dans le buffer et le </w:t>
+      </w:r>
+      <w:r>
+        <w:rPr>
+          <w:rFonts w:ascii="Arial" w:hAnsi="Arial" w:cs="Arial"/>
+        </w:rPr>
+        <w:t>résultat</w:t>
+      </w:r>
+      <w:r>
+        <w:rPr>
+          <w:rFonts w:ascii="Arial" w:hAnsi="Arial" w:cs="Arial"/>
+        </w:rPr>
+        <w:t xml:space="preserve"> de cette fonction s’insère dans le </w:t>
+      </w:r>
+      <w:r>
+        <w:rPr>
+          <w:rFonts w:ascii="Arial" w:hAnsi="Arial" w:cs="Arial"/>
+        </w:rPr>
+        <w:t>résultat</w:t>
+      </w:r>
+      <w:r>
+        <w:rPr>
+          <w:rFonts w:ascii="Arial" w:hAnsi="Arial" w:cs="Arial"/>
+        </w:rPr>
+        <w:t xml:space="preserve">. </w:t>
+      </w:r>
+    </w:p>
+    <w:p>
+      <w:pPr>
+        <w:rPr>
+          <w:rFonts w:ascii="Arial" w:hAnsi="Arial" w:cs="Arial"/>
+        </w:rPr>
+      </w:pPr>
+      <w:r>
+        <w:rPr>
+          <w:rFonts w:ascii="Arial" w:hAnsi="Arial" w:cs="Arial"/>
+        </w:rPr>
+        <w:t xml:space="preserve">Après obtention des deux timestamps : </w:t>
+      </w:r>
+      <w:r>
+        <w:rPr>
+          <w:rFonts w:ascii="Arial" w:hAnsi="Arial" w:cs="Arial"/>
+          <w:noProof/>
+          <w14:ligatures w14:val="standardContextual"/>
+        </w:rPr>
+        <w:drawing>
+          <wp:inline distT="0" distB="0" distL="0" distR="0" wp14:anchorId="48969058" wp14:editId="532C6E7D">
+            <wp:extent cx="5591175" cy="323850"/>
+            <wp:effectExtent l="0" t="0" r="9525" b="0"/>
+            <wp:docPr id="912678801" name="Picture 1"/>
+            <wp:cNvGraphicFramePr>
+              <a:graphicFrameLocks xmlns:a="http://schemas.openxmlformats.org/drawingml/2006/main" noChangeAspect="1"/>
+            </wp:cNvGraphicFramePr>
+            <a:graphic xmlns:a="http://schemas.openxmlformats.org/drawingml/2006/main">
+              <a:graphicData uri="http://schemas.openxmlformats.org/drawingml/2006/picture">
+                <pic:pic xmlns:pic="http://schemas.openxmlformats.org/drawingml/2006/picture">
+                  <pic:nvPicPr>
+                    <pic:cNvPr id="912678801" name=""/>
+                    <pic:cNvPicPr/>
+                  </pic:nvPicPr>
+                  <pic:blipFill>
+                    <a:blip r:embed="rId10"/>
+                    <a:stretch>
+                      <a:fillRect/>
+                    </a:stretch>
+                  </pic:blipFill>
+                  <pic:spPr>
+                    <a:xfrm>
+                      <a:off x="0" y="0"/>
+                      <a:ext cx="5591175" cy="323850"/>
+                    </a:xfrm>
+                    <a:prstGeom prst="rect">
+                      <a:avLst/>
+                    </a:prstGeom>
+                  </pic:spPr>
+                </pic:pic>
+              </a:graphicData>
+            </a:graphic>
+          </wp:inline>
+        </w:drawing>
+      </w:r>
+    </w:p>
+    <w:p>
+      <w:pPr>
+        <w:rPr>
+          <w:rFonts w:ascii="Arial" w:hAnsi="Arial" w:cs="Arial"/>
+        </w:rPr>
+      </w:pPr>
+      <w:r>
+        <w:rPr>
+          <w:rFonts w:ascii="Arial" w:hAnsi="Arial" w:cs="Arial"/>
+        </w:rPr>
+        <w:t>On a une comparaison qui permet de </w:t>
+      </w:r>
+      <w:r>
+        <w:rPr>
+          <w:rFonts w:ascii="Arial" w:hAnsi="Arial" w:cs="Arial"/>
+        </w:rPr>
+        <w:t>mesure</w:t>
+      </w:r>
+      <w:r>
+        <w:rPr>
+          <w:rFonts w:ascii="Arial" w:hAnsi="Arial" w:cs="Arial"/>
+        </w:rPr>
+        <w:t xml:space="preserve">r la </w:t>
+      </w:r>
+      <w:r>
+        <w:rPr>
+          <w:rFonts w:ascii="Arial" w:hAnsi="Arial" w:cs="Arial"/>
+        </w:rPr>
+        <w:t>différence de temps entre buffer_heure_locale1 et buffer_heure_locale2</w:t>
+      </w:r>
+      <w:r>
+        <w:rPr>
+          <w:rFonts w:ascii="Arial" w:hAnsi="Arial" w:cs="Arial"/>
+        </w:rPr>
+        <w:t xml:space="preserve"> </w:t>
+      </w:r>
+      <w:r>
+        <w:rPr>
+          <w:rFonts w:ascii="Arial" w:hAnsi="Arial" w:cs="Arial"/>
+        </w:rPr>
+        <w:t xml:space="preserve">et vérifie si cette durée est inférieure à </w:t>
+      </w:r>
+      <w:r>
+        <w:rPr>
+          <w:rFonts w:ascii="Arial" w:hAnsi="Arial" w:cs="Arial"/>
+        </w:rPr>
+        <w:t xml:space="preserve">0,2 secondes </w:t>
+      </w:r>
+      <w:r>
+        <w:rPr>
+          <w:rFonts w:ascii="Arial" w:hAnsi="Arial" w:cs="Arial"/>
+        </w:rPr>
+        <w:t xml:space="preserve">(0xbebc201 c’est en fait </w:t>
+      </w:r>
+      <w:r>
+        <w:rPr>
+          <w:rFonts w:ascii="Arial" w:hAnsi="Arial" w:cs="Arial"/>
+        </w:rPr>
+        <w:t>200000001</w:t>
+      </w:r>
+      <w:r>
+        <w:rPr>
+          <w:rFonts w:ascii="Arial" w:hAnsi="Arial" w:cs="Arial"/>
+        </w:rPr>
+        <w:t xml:space="preserve"> en décimal)</w:t>
+      </w:r>
+      <w:r>
+        <w:rPr>
+          <w:rFonts w:ascii="Arial" w:hAnsi="Arial" w:cs="Arial"/>
+        </w:rPr>
+        <w:t>.</w:t>
+      </w:r>
+      <w:r>
+        <w:rPr>
+          <w:rFonts w:ascii="Arial" w:hAnsi="Arial" w:cs="Arial"/>
+        </w:rPr>
+        <w:t xml:space="preserve"> Ici c’est surement une protection antidebug qui permet de mesurer les écarts entre les steps des instructions</w:t>
+      </w:r>
+      <w:r>
+        <w:rPr>
+          <w:rFonts w:ascii="Arial" w:hAnsi="Arial" w:cs="Arial"/>
+        </w:rPr>
+        <w:t>.</w:t>
+      </w:r>
+    </w:p>
+    <w:p>
+      <w:pPr>
+        <w:rPr>
+          <w:rFonts w:ascii="Arial" w:hAnsi="Arial" w:cs="Arial"/>
+        </w:rPr>
+      </w:pPr>
+      <w:r>
+        <w:rPr>
+          <w:rFonts w:ascii="Arial" w:hAnsi="Arial" w:cs="Arial"/>
+        </w:rPr>
+        <w:t xml:space="preserve">Je peux changer </w:t>
+      </w:r>
+      <w:r>
+        <w:rPr>
+          <w:rFonts w:ascii="Arial" w:hAnsi="Arial" w:cs="Arial"/>
+        </w:rPr>
+        <w:t>l’instruction JG en JLE</w:t>
+      </w:r>
+      <w:r>
+        <w:rPr>
+          <w:rFonts w:ascii="Arial" w:hAnsi="Arial" w:cs="Arial"/>
+        </w:rPr>
+        <w:t xml:space="preserve"> pour la skip et attendre plus de 0,2 secondes lors du debug.</w:t>
+      </w:r>
+    </w:p>
+    <w:p>
+      <w:pPr>
+        <w:rPr>
+          <w:rFonts w:ascii="Arial" w:hAnsi="Arial" w:cs="Arial"/>
+        </w:rPr>
+      </w:pPr>
+      <w:r>
+        <w:rPr>
+          <w:rFonts w:ascii="Arial" w:hAnsi="Arial" w:cs="Arial"/>
+        </w:rPr>
+        <w:t xml:space="preserve">Ça devient ensuite plus intéressant. On a une fonction </w:t>
+      </w:r>
+      <w:r>
+        <w:rPr>
+          <w:rFonts w:ascii="Arial" w:hAnsi="Arial" w:cs="Arial"/>
+        </w:rPr>
+        <w:t>create_lab_ssh_artifact.isra.0()</w:t>
+      </w:r>
+      <w:r>
+        <w:rPr>
+          <w:rFonts w:ascii="Arial" w:hAnsi="Arial" w:cs="Arial"/>
+        </w:rPr>
+        <w:t xml:space="preserve"> qui de part son </w:t>
+      </w:r>
+      <w:r>
+        <w:rPr>
+          <w:rFonts w:ascii="Arial" w:hAnsi="Arial" w:cs="Arial"/>
+        </w:rPr>
+        <w:t xml:space="preserve">analysé </w:t>
+      </w:r>
+      <w:r>
+        <w:rPr>
+          <w:rFonts w:ascii="Arial" w:hAnsi="Arial" w:cs="Arial"/>
+        </w:rPr>
+        <w:t>nom semble créer un artéfact ssh</w:t>
+      </w:r>
+      <w:r>
+        <w:rPr>
+          <w:rFonts w:ascii="Arial" w:hAnsi="Arial" w:cs="Arial"/>
+        </w:rPr>
+        <w:t xml:space="preserve">. Puis le programme </w:t>
+      </w:r>
+      <w:r>
+        <w:rPr>
+          <w:rFonts w:ascii="Arial" w:hAnsi="Arial" w:cs="Arial"/>
+        </w:rPr>
+        <w:t>« intercepte » tout les signaux sigterm ou sigint qui sont les signaux 2 et 15 (0xf en décimal est 15) et exécute le handle_signal qui permet juste de mettre le keep_running à 1.</w:t>
+      </w:r>
+    </w:p>
+    <w:p>
+      <w:pPr>
+        <w:rPr>
+          <w:rFonts w:ascii="Arial" w:hAnsi="Arial" w:cs="Arial"/>
+        </w:rPr>
+      </w:pPr>
+      <w:r>
+        <w:rPr>
+          <w:rFonts w:ascii="Arial" w:hAnsi="Arial" w:cs="Arial"/>
+          <w:noProof/>
+          <w14:ligatures w14:val="standardContextual"/>
+        </w:rPr>
+        <w:drawing>
+          <wp:inline distT="0" distB="0" distL="0" distR="0" wp14:anchorId="4BB00E57" wp14:editId="3C230E5A">
+            <wp:extent cx="2295525" cy="504825"/>
+            <wp:effectExtent l="0" t="0" r="9525" b="9525"/>
+            <wp:docPr id="2040392829" name="Picture 1"/>
+            <wp:cNvGraphicFramePr>
+              <a:graphicFrameLocks xmlns:a="http://schemas.openxmlformats.org/drawingml/2006/main" noChangeAspect="1"/>
+            </wp:cNvGraphicFramePr>
+            <a:graphic xmlns:a="http://schemas.openxmlformats.org/drawingml/2006/main">
+              <a:graphicData uri="http://schemas.openxmlformats.org/drawingml/2006/picture">
+                <pic:pic xmlns:pic="http://schemas.openxmlformats.org/drawingml/2006/picture">
+                  <pic:nvPicPr>
+                    <pic:cNvPr id="2040392829" name=""/>
+                    <pic:cNvPicPr/>
+                  </pic:nvPicPr>
+                  <pic:blipFill>
+                    <a:blip r:embed="rId11"/>
+                    <a:stretch>
+                      <a:fillRect/>
+                    </a:stretch>
+                  </pic:blipFill>
+                  <pic:spPr>
+                    <a:xfrm>
+                      <a:off x="0" y="0"/>
+                      <a:ext cx="2295525" cy="504825"/>
+                    </a:xfrm>
+                    <a:prstGeom prst="rect">
+                      <a:avLst/>
+                    </a:prstGeom>
+                  </pic:spPr>
+                </pic:pic>
+              </a:graphicData>
+            </a:graphic>
+          </wp:inline>
+        </w:drawing>
+      </w:r>
+    </w:p>
+    <w:p>
+      <w:pPr>
+        <w:rPr>
+          <w:rFonts w:ascii="Arial" w:hAnsi="Arial" w:cs="Arial"/>
+        </w:rPr>
+      </w:pPr>
+      <w:r>
+        <w:rPr>
+          <w:rFonts w:ascii="Arial" w:hAnsi="Arial" w:cs="Arial"/>
+        </w:rPr>
+        <w:t xml:space="preserve">Avant de passer </w:t>
+      </w:r>
+      <w:r>
+        <w:rPr>
+          <w:rFonts w:ascii="Arial" w:hAnsi="Arial" w:cs="Arial"/>
+        </w:rPr>
+        <w:t>à</w:t>
+      </w:r>
+      <w:r>
+        <w:rPr>
+          <w:rFonts w:ascii="Arial" w:hAnsi="Arial" w:cs="Arial"/>
+        </w:rPr>
+        <w:t xml:space="preserve"> la suite on regarde la fonction create_lab_ssh_artifact.isra.0() : </w:t>
+      </w:r>
+    </w:p>
+    <w:p>
+      <w:pPr>
+        <w:rPr>
+          <w:rFonts w:ascii="Arial" w:hAnsi="Arial" w:cs="Arial"/>
+        </w:rPr>
+      </w:pPr>
+      <w:r>
+        <w:rPr>
+          <w:rFonts w:ascii="Arial" w:hAnsi="Arial" w:cs="Arial"/>
+        </w:rPr>
+        <w:t xml:space="preserve">Dans cette fonction on voit qu’il </w:t>
+      </w:r>
+      <w:r>
+        <w:rPr>
+          <w:rFonts w:ascii="Arial" w:hAnsi="Arial" w:cs="Arial"/>
+        </w:rPr>
+        <w:t xml:space="preserve">vérifie que le répertoire ~/.ssh </w:t>
+      </w:r>
+      <w:r>
+        <w:rPr>
+          <w:rFonts w:ascii="Arial" w:hAnsi="Arial" w:cs="Arial"/>
+        </w:rPr>
+        <w:t>existe et le créée sinon</w:t>
+      </w:r>
+      <w:r>
+        <w:rPr>
+          <w:rFonts w:ascii="Arial" w:hAnsi="Arial" w:cs="Arial"/>
+        </w:rPr>
+        <w:t xml:space="preserve"> : </w:t>
+      </w:r>
+    </w:p>
+    <w:p>
+      <w:pPr>
+        <w:rPr>
+          <w:rFonts w:ascii="Arial" w:hAnsi="Arial" w:cs="Arial"/>
+        </w:rPr>
+      </w:pPr>
+      <w:r>
+        <w:rPr>
+          <w:rFonts w:ascii="Arial" w:hAnsi="Arial" w:cs="Arial"/>
+          <w:noProof/>
+          <w14:ligatures w14:val="standardContextual"/>
+        </w:rPr>
+        <w:drawing>
+          <wp:inline distT="0" distB="0" distL="0" distR="0" wp14:anchorId="2101CF6A" wp14:editId="5D7EDE7D">
+            <wp:extent cx="4743450" cy="628650"/>
+            <wp:effectExtent l="0" t="0" r="0" b="0"/>
+            <wp:docPr id="41784404" name="Picture 1"/>
+            <wp:cNvGraphicFramePr>
+              <a:graphicFrameLocks xmlns:a="http://schemas.openxmlformats.org/drawingml/2006/main" noChangeAspect="1"/>
+            </wp:cNvGraphicFramePr>
+            <a:graphic xmlns:a="http://schemas.openxmlformats.org/drawingml/2006/main">
+              <a:graphicData uri="http://schemas.openxmlformats.org/drawingml/2006/picture">
+                <pic:pic xmlns:pic="http://schemas.openxmlformats.org/drawingml/2006/picture">
+                  <pic:nvPicPr>
+                    <pic:cNvPr id="41784404" name=""/>
+                    <pic:cNvPicPr/>
+                  </pic:nvPicPr>
+                  <pic:blipFill>
+                    <a:blip r:embed="rId12"/>
+                    <a:stretch>
+                      <a:fillRect/>
+                    </a:stretch>
+                  </pic:blipFill>
+                  <pic:spPr>
+                    <a:xfrm>
+                      <a:off x="0" y="0"/>
+                      <a:ext cx="4743450" cy="628650"/>
+                    </a:xfrm>
+                    <a:prstGeom prst="rect">
+                      <a:avLst/>
+                    </a:prstGeom>
+                  </pic:spPr>
+                </pic:pic>
+              </a:graphicData>
+            </a:graphic>
+          </wp:inline>
+        </w:drawing>
+      </w:r>
+    </w:p>
+    <w:p>
+      <w:pPr>
+        <w:rPr>
+          <w:rFonts w:ascii="Arial" w:hAnsi="Arial" w:cs="Arial"/>
+        </w:rPr>
+      </w:pPr>
+      <w:r>
+        <w:rPr>
+          <w:rFonts w:ascii="Arial" w:hAnsi="Arial" w:cs="Arial"/>
+        </w:rPr>
+        <w:t xml:space="preserve">Puis créée </w:t>
+      </w:r>
+      <w:r>
+        <w:rPr>
+          <w:rFonts w:ascii="Arial" w:hAnsi="Arial" w:cs="Arial"/>
+        </w:rPr>
+        <w:t>un répertoire ~/.ssh/</w:t>
+      </w:r>
+      <w:r>
+        <w:rPr>
+          <w:rFonts w:ascii="Arial" w:hAnsi="Arial" w:cs="Arial"/>
+        </w:rPr>
+        <w:t>qs_reverse_lab</w:t>
+      </w:r>
+      <w:r>
+        <w:rPr>
+          <w:rFonts w:ascii="Arial" w:hAnsi="Arial" w:cs="Arial"/>
+        </w:rPr>
+        <w:t xml:space="preserve"> : </w:t>
+      </w:r>
+    </w:p>
+    <w:p>
+      <w:pPr>
+        <w:rPr>
+          <w:rFonts w:ascii="Arial" w:hAnsi="Arial" w:cs="Arial"/>
+        </w:rPr>
+      </w:pPr>
+      <w:r>
+        <w:rPr>
+          <w:rFonts w:ascii="Arial" w:hAnsi="Arial" w:cs="Arial"/>
+          <w:noProof/>
+          <w14:ligatures w14:val="standardContextual"/>
+        </w:rPr>
+        <w:drawing>
+          <wp:inline distT="0" distB="0" distL="0" distR="0" wp14:anchorId="44342D61" wp14:editId="20BDAA65">
+            <wp:extent cx="5857875" cy="219075"/>
+            <wp:effectExtent l="0" t="0" r="9525" b="9525"/>
+            <wp:docPr id="1887674185" name="Picture 1"/>
+            <wp:cNvGraphicFramePr>
+              <a:graphicFrameLocks xmlns:a="http://schemas.openxmlformats.org/drawingml/2006/main" noChangeAspect="1"/>
+            </wp:cNvGraphicFramePr>
+            <a:graphic xmlns:a="http://schemas.openxmlformats.org/drawingml/2006/main">
+              <a:graphicData uri="http://schemas.openxmlformats.org/drawingml/2006/picture">
+                <pic:pic xmlns:pic="http://schemas.openxmlformats.org/drawingml/2006/picture">
+                  <pic:nvPicPr>
+                    <pic:cNvPr id="1887674185" name=""/>
+                    <pic:cNvPicPr/>
+                  </pic:nvPicPr>
+                  <pic:blipFill>
+                    <a:blip r:embed="rId13"/>
+                    <a:stretch>
+                      <a:fillRect/>
+                    </a:stretch>
+                  </pic:blipFill>
+                  <pic:spPr>
+                    <a:xfrm>
+                      <a:off x="0" y="0"/>
+                      <a:ext cx="5857875" cy="219075"/>
+                    </a:xfrm>
+                    <a:prstGeom prst="rect">
+                      <a:avLst/>
+                    </a:prstGeom>
+                  </pic:spPr>
+                </pic:pic>
+              </a:graphicData>
+            </a:graphic>
+          </wp:inline>
+        </w:drawing>
+      </w:r>
+    </w:p>
+    <w:p>
+      <w:pPr>
+        <w:rPr>
+          <w:rFonts w:ascii="Arial" w:hAnsi="Arial" w:cs="Arial"/>
+        </w:rPr>
+      </w:pPr>
+      <w:r>
+        <w:rPr>
+          <w:rFonts w:ascii="Arial" w:hAnsi="Arial" w:cs="Arial"/>
+        </w:rPr>
+        <w:t xml:space="preserve">Ensuite une fois créés il insère un fichier en mode écriture seule, le créée si il existe pas et append sinon : </w:t>
+      </w:r>
+    </w:p>
+    <w:p>
+      <w:pPr>
+        <w:rPr>
+          <w:rFonts w:ascii="Arial" w:hAnsi="Arial" w:cs="Arial"/>
+        </w:rPr>
+      </w:pPr>
+      <w:r>
+        <w:rPr>
+          <w:noProof/>
+          <w14:ligatures w14:val="standardContextual"/>
+        </w:rPr>
+        <w:drawing>
+          <wp:inline distT="0" distB="0" distL="0" distR="0" wp14:anchorId="7CBDD972" wp14:editId="1A4BF868">
+            <wp:extent cx="5734050" cy="1095375"/>
+            <wp:effectExtent l="0" t="0" r="0" b="9525"/>
+            <wp:docPr id="539106651" name="Picture 1"/>
+            <wp:cNvGraphicFramePr>
+              <a:graphicFrameLocks xmlns:a="http://schemas.openxmlformats.org/drawingml/2006/main" noChangeAspect="1"/>
+            </wp:cNvGraphicFramePr>
+            <a:graphic xmlns:a="http://schemas.openxmlformats.org/drawingml/2006/main">
+              <a:graphicData uri="http://schemas.openxmlformats.org/drawingml/2006/picture">
+                <pic:pic xmlns:pic="http://schemas.openxmlformats.org/drawingml/2006/picture">
+                  <pic:nvPicPr>
+                    <pic:cNvPr id="539106651" name=""/>
+                    <pic:cNvPicPr/>
+                  </pic:nvPicPr>
+                  <pic:blipFill>
+                    <a:blip r:embed="rId14"/>
+                    <a:stretch>
+                      <a:fillRect/>
+                    </a:stretch>
+                  </pic:blipFill>
+                  <pic:spPr>
+                    <a:xfrm>
+                      <a:off x="0" y="0"/>
+                      <a:ext cx="5734050" cy="1095375"/>
+                    </a:xfrm>
+                    <a:prstGeom prst="rect">
+                      <a:avLst/>
+                    </a:prstGeom>
+                  </pic:spPr>
+                </pic:pic>
+              </a:graphicData>
+            </a:graphic>
+          </wp:inline>
+        </w:drawing>
+      </w:r>
+    </w:p>
+    <w:p>
+      <w:pPr>
+        <w:rPr>
+          <w:rFonts w:ascii="Arial" w:hAnsi="Arial" w:cs="Arial"/>
+        </w:rPr>
+      </w:pPr>
+      <w:r>
+        <w:rPr>
+          <w:rFonts w:ascii="Arial" w:hAnsi="Arial" w:cs="Arial"/>
+        </w:rPr>
+        <w:t xml:space="preserve">Ici on voit que l’artéfact est créé, qu’il contient 3 informations qui </w:t>
+      </w:r>
+      <w:r>
+        <w:rPr>
+          <w:rFonts w:ascii="Arial" w:hAnsi="Arial" w:cs="Arial"/>
+        </w:rPr>
+        <w:t>génèrent un artéfact</w:t>
+      </w:r>
+      <w:r>
+        <w:rPr>
+          <w:rFonts w:ascii="Arial" w:hAnsi="Arial" w:cs="Arial"/>
+        </w:rPr>
+        <w:t xml:space="preserve"> ssh</w:t>
+      </w:r>
+      <w:r>
+        <w:rPr>
+          <w:rFonts w:ascii="Arial" w:hAnsi="Arial" w:cs="Arial"/>
+        </w:rPr>
+        <w:t xml:space="preserve"> avec </w:t>
+      </w:r>
+      <w:r>
+        <w:rPr>
+          <w:rFonts w:ascii="Arial" w:hAnsi="Arial" w:cs="Arial"/>
+        </w:rPr>
+        <w:t xml:space="preserve">deux pid, un de l’host et un du malware ainsi qu’un </w:t>
+      </w:r>
+      <w:r>
+        <w:rPr>
+          <w:rFonts w:ascii="Arial" w:hAnsi="Arial" w:cs="Arial"/>
+        </w:rPr>
+        <w:t>timestamp.</w:t>
+      </w:r>
+    </w:p>
+    <w:p>
+      <w:pPr>
+        <w:rPr>
+          <w:rFonts w:ascii="Arial" w:hAnsi="Arial" w:cs="Arial"/>
+        </w:rPr>
+      </w:pPr>
+      <w:r>
+        <w:rPr>
+          <w:rFonts w:ascii="Arial" w:hAnsi="Arial" w:cs="Arial"/>
+        </w:rPr>
+        <w:lastRenderedPageBreak/>
+        <w:t>Après l’artéfact créé, le programme recheck que les timestamps sont toujours bons et lance une fonction « http_beacon_once() ; »</w:t>
+      </w:r>
+    </w:p>
+    <w:p>
+      <w:pPr>
+        <w:rPr>
+          <w:rFonts w:ascii="Arial" w:hAnsi="Arial" w:cs="Arial"/>
+        </w:rPr>
+      </w:pPr>
+      <w:r>
+        <w:rPr>
+          <w:rFonts w:ascii="Arial" w:hAnsi="Arial" w:cs="Arial"/>
+        </w:rPr>
+        <w:t xml:space="preserve">Cette fonction ouvre une socket </w:t>
+      </w:r>
+      <w:r>
+        <w:rPr>
+          <w:rFonts w:ascii="Arial" w:hAnsi="Arial" w:cs="Arial"/>
+        </w:rPr>
+        <w:t>IPv4 avec un flux TCP et le protocole automatique.</w:t>
+      </w:r>
+    </w:p>
+    <w:p>
+      <w:pPr>
+        <w:rPr>
+          <w:rFonts w:ascii="Arial" w:hAnsi="Arial" w:cs="Arial"/>
+        </w:rPr>
+      </w:pPr>
+      <w:r>
+        <w:rPr>
+          <w:rFonts w:ascii="Arial" w:hAnsi="Arial" w:cs="Arial"/>
+        </w:rPr>
+        <w:t>Ensuite on configure une structure d’adresse de socket IPv4 pour cibler une adresse 80.15.88.75 sur le port 80 (P en hexa)</w:t>
+      </w:r>
+    </w:p>
+    <w:p>
+      <w:pPr>
+        <w:rPr>
+          <w:rFonts w:ascii="Arial" w:hAnsi="Arial" w:cs="Arial"/>
+        </w:rPr>
+      </w:pPr>
+      <w:r>
+        <w:rPr>
+          <w:noProof/>
+          <w14:ligatures w14:val="standardContextual"/>
+        </w:rPr>
+        <w:drawing>
+          <wp:inline distT="0" distB="0" distL="0" distR="0" wp14:anchorId="7723F92D" wp14:editId="3A1B1A4D">
+            <wp:extent cx="4752975" cy="628650"/>
+            <wp:effectExtent l="0" t="0" r="9525" b="0"/>
+            <wp:docPr id="1521704975" name="Picture 1"/>
+            <wp:cNvGraphicFramePr>
+              <a:graphicFrameLocks xmlns:a="http://schemas.openxmlformats.org/drawingml/2006/main" noChangeAspect="1"/>
+            </wp:cNvGraphicFramePr>
+            <a:graphic xmlns:a="http://schemas.openxmlformats.org/drawingml/2006/main">
+              <a:graphicData uri="http://schemas.openxmlformats.org/drawingml/2006/picture">
+                <pic:pic xmlns:pic="http://schemas.openxmlformats.org/drawingml/2006/picture">
+                  <pic:nvPicPr>
+                    <pic:cNvPr id="1521704975" name=""/>
+                    <pic:cNvPicPr/>
+                  </pic:nvPicPr>
+                  <pic:blipFill>
+                    <a:blip r:embed="rId15"/>
+                    <a:stretch>
+                      <a:fillRect/>
+                    </a:stretch>
+                  </pic:blipFill>
+                  <pic:spPr>
+                    <a:xfrm>
+                      <a:off x="0" y="0"/>
+                      <a:ext cx="4752975" cy="628650"/>
+                    </a:xfrm>
+                    <a:prstGeom prst="rect">
+                      <a:avLst/>
+                    </a:prstGeom>
+                  </pic:spPr>
+                </pic:pic>
+              </a:graphicData>
+            </a:graphic>
+          </wp:inline>
+        </w:drawing>
+      </w:r>
+    </w:p>
+    <w:p>
+      <w:pPr>
+        <w:rPr>
+          <w:rFonts w:ascii="Arial" w:hAnsi="Arial" w:cs="Arial"/>
+        </w:rPr>
+      </w:pPr>
+      <w:r>
+        <w:rPr>
+          <w:rFonts w:ascii="Arial" w:hAnsi="Arial" w:cs="Arial"/>
+        </w:rPr>
+        <w:t xml:space="preserve">Après une manipulation </w:t>
+      </w:r>
+      <w:r>
+        <w:rPr>
+          <w:rFonts w:ascii="Arial" w:hAnsi="Arial" w:cs="Arial"/>
+        </w:rPr>
+        <w:t>des descripteurs</w:t>
+      </w:r>
+      <w:r>
+        <w:rPr>
+          <w:rFonts w:ascii="Arial" w:hAnsi="Arial" w:cs="Arial"/>
+        </w:rPr>
+        <w:t xml:space="preserve"> qui permettent de rendre la socket non bloquante en cas d’échec de connexions etc. </w:t>
+      </w:r>
+      <w:r>
+        <w:rPr>
+          <w:rFonts w:ascii="Arial" w:hAnsi="Arial" w:cs="Arial"/>
+        </w:rPr>
+        <w:t>on a quelque chose</w:t>
+      </w:r>
+      <w:r>
+        <w:rPr>
+          <w:rFonts w:ascii="Arial" w:hAnsi="Arial" w:cs="Arial"/>
+        </w:rPr>
+        <w:t xml:space="preserve"> </w:t>
+      </w:r>
+      <w:r>
+        <w:rPr>
+          <w:rFonts w:ascii="Arial" w:hAnsi="Arial" w:cs="Arial"/>
+        </w:rPr>
+        <w:t xml:space="preserve">: </w:t>
+      </w:r>
+    </w:p>
+    <w:p>
+      <w:pPr>
+        <w:rPr>
+          <w:rFonts w:ascii="Arial" w:hAnsi="Arial" w:cs="Arial"/>
+        </w:rPr>
+      </w:pPr>
+      <w:r>
+        <w:rPr>
+          <w:noProof/>
+          <w14:ligatures w14:val="standardContextual"/>
+        </w:rPr>
+        <w:drawing>
+          <wp:inline distT="0" distB="0" distL="0" distR="0" wp14:anchorId="0F75F0C8" wp14:editId="2093E518">
+            <wp:extent cx="6645910" cy="1518920"/>
+            <wp:effectExtent l="0" t="0" r="2540" b="5080"/>
+            <wp:docPr id="2049445322" name="Picture 1"/>
+            <wp:cNvGraphicFramePr>
+              <a:graphicFrameLocks xmlns:a="http://schemas.openxmlformats.org/drawingml/2006/main" noChangeAspect="1"/>
+            </wp:cNvGraphicFramePr>
+            <a:graphic xmlns:a="http://schemas.openxmlformats.org/drawingml/2006/main">
+              <a:graphicData uri="http://schemas.openxmlformats.org/drawingml/2006/picture">
+                <pic:pic xmlns:pic="http://schemas.openxmlformats.org/drawingml/2006/picture">
+                  <pic:nvPicPr>
+                    <pic:cNvPr id="2049445322" name=""/>
+                    <pic:cNvPicPr/>
+                  </pic:nvPicPr>
+                  <pic:blipFill>
+                    <a:blip r:embed="rId16"/>
+                    <a:stretch>
+                      <a:fillRect/>
+                    </a:stretch>
+                  </pic:blipFill>
+                  <pic:spPr>
+                    <a:xfrm>
+                      <a:off x="0" y="0"/>
+                      <a:ext cx="6645910" cy="1518920"/>
+                    </a:xfrm>
+                    <a:prstGeom prst="rect">
+                      <a:avLst/>
+                    </a:prstGeom>
+                  </pic:spPr>
+                </pic:pic>
+              </a:graphicData>
+            </a:graphic>
+          </wp:inline>
+        </w:drawing>
+      </w:r>
+    </w:p>
+    <w:p>
+      <w:pPr>
+        <w:rPr>
+          <w:rFonts w:ascii="Arial" w:hAnsi="Arial" w:cs="Arial"/>
+        </w:rPr>
+      </w:pPr>
+      <w:r>
+        <w:rPr>
+          <w:rFonts w:ascii="Arial" w:hAnsi="Arial" w:cs="Arial"/>
+        </w:rPr>
+        <w:t>Ici on voit qu’on fait un connect d</w:t>
+      </w:r>
+      <w:r>
+        <w:rPr>
+          <w:rFonts w:ascii="Arial" w:hAnsi="Arial" w:cs="Arial"/>
+        </w:rPr>
+        <w:t xml:space="preserve">e la socket </w:t>
+      </w:r>
+      <w:r>
+        <w:rPr>
+          <w:rFonts w:ascii="Arial" w:hAnsi="Arial" w:cs="Arial"/>
+        </w:rPr>
+        <w:t xml:space="preserve">sur </w:t>
+      </w:r>
+      <w:r>
+        <w:rPr>
+          <w:rFonts w:ascii="Arial" w:hAnsi="Arial" w:cs="Arial"/>
+        </w:rPr>
+        <w:t>la cible</w:t>
+      </w:r>
+      <w:r>
+        <w:rPr>
+          <w:rFonts w:ascii="Arial" w:hAnsi="Arial" w:cs="Arial"/>
+        </w:rPr>
+        <w:t>. Ensuite on garde le pid du malware dans une variable.</w:t>
+      </w:r>
+    </w:p>
+    <w:p>
+      <w:pPr>
+        <w:rPr>
+          <w:rFonts w:ascii="Arial" w:hAnsi="Arial" w:cs="Arial"/>
+        </w:rPr>
+      </w:pPr>
+      <w:r>
+        <w:rPr>
+          <w:rFonts w:ascii="Arial" w:hAnsi="Arial" w:cs="Arial"/>
+        </w:rPr>
+        <w:t xml:space="preserve">Il écrit ensuite dans un fichier une commande GET tel que l’id est le pid </w:t>
+      </w:r>
+      <w:r>
+        <w:rPr>
+          <w:rFonts w:ascii="Arial" w:hAnsi="Arial" w:cs="Arial"/>
+        </w:rPr>
+        <w:t>pour récupérer du code ou autre chose au serveur malveillant.</w:t>
+      </w:r>
+    </w:p>
+    <w:p>
+      <w:pPr>
+        <w:rPr>
+          <w:rFonts w:ascii="Arial" w:hAnsi="Arial" w:cs="Arial"/>
+        </w:rPr>
+      </w:pPr>
+      <w:r>
+        <w:rPr>
+          <w:rFonts w:ascii="Arial" w:hAnsi="Arial" w:cs="Arial"/>
+        </w:rPr>
+        <w:t>La fonction utilise une boucle avec poll() pour attendre que la socket soit prête à l'écriture, puis transmet les données</w:t>
+      </w:r>
+      <w:r>
+        <w:rPr>
+          <w:rFonts w:ascii="Arial" w:hAnsi="Arial" w:cs="Arial"/>
+        </w:rPr>
+        <w:t xml:space="preserve"> avec un write sur le descripteur.</w:t>
+      </w:r>
+    </w:p>
+    <w:p>
+      <w:pPr>
+        <w:rPr>
+          <w:rFonts w:ascii="Arial" w:hAnsi="Arial" w:cs="Arial"/>
+        </w:rPr>
+      </w:pPr>
+      <w:r>
+        <w:rPr>
+          <w:rFonts w:ascii="Arial" w:hAnsi="Arial" w:cs="Arial"/>
+        </w:rPr>
+        <w:drawing>
+          <wp:inline distT="0" distB="0" distL="0" distR="0" wp14:anchorId="491EAE56" wp14:editId="3912F794">
+            <wp:extent cx="5124450" cy="266700"/>
+            <wp:effectExtent l="0" t="0" r="0" b="0"/>
+            <wp:docPr id="647817722" name="Picture 1"/>
+            <wp:cNvGraphicFramePr>
+              <a:graphicFrameLocks xmlns:a="http://schemas.openxmlformats.org/drawingml/2006/main" noChangeAspect="1"/>
+            </wp:cNvGraphicFramePr>
+            <a:graphic xmlns:a="http://schemas.openxmlformats.org/drawingml/2006/main">
+              <a:graphicData uri="http://schemas.openxmlformats.org/drawingml/2006/picture">
+                <pic:pic xmlns:pic="http://schemas.openxmlformats.org/drawingml/2006/picture">
+                  <pic:nvPicPr>
+                    <pic:cNvPr id="647817722" name=""/>
+                    <pic:cNvPicPr/>
+                  </pic:nvPicPr>
+                  <pic:blipFill>
+                    <a:blip r:embed="rId17"/>
+                    <a:stretch>
+                      <a:fillRect/>
+                    </a:stretch>
+                  </pic:blipFill>
+                  <pic:spPr>
+                    <a:xfrm>
+                      <a:off x="0" y="0"/>
+                      <a:ext cx="5124450" cy="266700"/>
+                    </a:xfrm>
+                    <a:prstGeom prst="rect">
+                      <a:avLst/>
+                    </a:prstGeom>
+                  </pic:spPr>
+                </pic:pic>
+              </a:graphicData>
+            </a:graphic>
+          </wp:inline>
+        </w:drawing>
+      </w:r>
+    </w:p>
+    <w:p>
+      <w:pPr>
+        <w:rPr>
+          <w:rFonts w:ascii="Arial" w:hAnsi="Arial" w:cs="Arial"/>
+        </w:rPr>
+      </w:pPr>
+      <w:r>
+        <w:rPr>
+          <w:rFonts w:ascii="Arial" w:hAnsi="Arial" w:cs="Arial"/>
+        </w:rPr>
+        <w:t xml:space="preserve">Si la requête a bien été envoyée, le programme bascule en mode lecture. Il attend la réponse </w:t>
+      </w:r>
+      <w:r>
+        <w:rPr>
+          <w:rFonts w:ascii="Arial" w:hAnsi="Arial" w:cs="Arial"/>
+        </w:rPr>
+        <w:t xml:space="preserve">du serveur distant : </w:t>
+      </w:r>
+    </w:p>
+    <w:p>
+      <w:pPr>
+        <w:rPr>
+          <w:rFonts w:ascii="Arial" w:hAnsi="Arial" w:cs="Arial"/>
+        </w:rPr>
+      </w:pPr>
+      <w:r>
+        <w:rPr>
+          <w:noProof/>
+          <w14:ligatures w14:val="standardContextual"/>
+        </w:rPr>
+        <w:drawing>
+          <wp:inline distT="0" distB="0" distL="0" distR="0" wp14:anchorId="2CD0FCC0" wp14:editId="687D1675">
+            <wp:extent cx="3514725" cy="333375"/>
+            <wp:effectExtent l="0" t="0" r="9525" b="9525"/>
+            <wp:docPr id="375121016" name="Picture 1"/>
+            <wp:cNvGraphicFramePr>
+              <a:graphicFrameLocks xmlns:a="http://schemas.openxmlformats.org/drawingml/2006/main" noChangeAspect="1"/>
+            </wp:cNvGraphicFramePr>
+            <a:graphic xmlns:a="http://schemas.openxmlformats.org/drawingml/2006/main">
+              <a:graphicData uri="http://schemas.openxmlformats.org/drawingml/2006/picture">
+                <pic:pic xmlns:pic="http://schemas.openxmlformats.org/drawingml/2006/picture">
+                  <pic:nvPicPr>
+                    <pic:cNvPr id="375121016" name=""/>
+                    <pic:cNvPicPr/>
+                  </pic:nvPicPr>
+                  <pic:blipFill>
+                    <a:blip r:embed="rId18"/>
+                    <a:stretch>
+                      <a:fillRect/>
+                    </a:stretch>
+                  </pic:blipFill>
+                  <pic:spPr>
+                    <a:xfrm>
+                      <a:off x="0" y="0"/>
+                      <a:ext cx="3514725" cy="333375"/>
+                    </a:xfrm>
+                    <a:prstGeom prst="rect">
+                      <a:avLst/>
+                    </a:prstGeom>
+                  </pic:spPr>
+                </pic:pic>
+              </a:graphicData>
+            </a:graphic>
+          </wp:inline>
+        </w:drawing>
+      </w:r>
+    </w:p>
+    <w:p>
+      <w:pPr>
+        <w:tabs>
+          <w:tab w:val="left" w:pos="886"/>
+        </w:tabs>
+        <w:rPr>
+          <w:rFonts w:ascii="Arial" w:hAnsi="Arial" w:cs="Arial"/>
+        </w:rPr>
+      </w:pPr>
+      <w:r>
+        <w:rPr>
+          <w:rFonts w:ascii="Arial" w:hAnsi="Arial" w:cs="Arial"/>
+        </w:rPr>
+        <w:t>Je n’ai pas assez de temp pour vérifier la suite mais le programme récupère du code malveillant a un serveur de manière répétée (toutes les secondes)</w:t>
+      </w:r>
+    </w:p>
+    <w:p>
+      <w:pPr>
+        <w:rPr>
+          <w:rFonts w:ascii="Arial" w:hAnsi="Arial" w:cs="Arial"/>
+        </w:rPr>
+      </w:pPr>
+      <w:r>
+        <w:rPr>
+          <w:rFonts w:ascii="Arial" w:hAnsi="Arial" w:cs="Arial"/>
+        </w:rPr>
+        <w:t xml:space="preserve">Je n’ai pas patch le malware mais c’est possible en changeant JZ en JNZ dans un instruction de vérification de keep_running </w:t>
+      </w:r>
+      <w:r>
+        <w:rPr>
+          <w:rFonts w:ascii="Arial" w:hAnsi="Arial" w:cs="Arial"/>
+        </w:rPr>
+        <w:t>pour skip la partie GET du code malveillant</w:t>
+      </w:r>
+    </w:p>
+    <w:p>
+      <w:pPr>
         <w:pStyle w:val="TITREIII"/>
-      </w:pPr>
-      <w:r>
+        <w:rPr>
+          <w:rFonts w:ascii="Arial" w:hAnsi="Arial" w:cs="Arial"/>
+        </w:rPr>
+      </w:pPr>
+      <w:r>
+        <w:rPr>
+          <w:rFonts w:ascii="Arial" w:hAnsi="Arial" w:cs="Arial"/>
+        </w:rPr>
         <w:t>Analyse dynamique</w:t>
       </w:r>
     </w:p>
     <w:p>
-      <w:r>
+      <w:pPr>
+        <w:rPr>
+          <w:rFonts w:ascii="Arial" w:hAnsi="Arial" w:cs="Arial"/>
+        </w:rPr>
+      </w:pPr>
+      <w:r>
+        <w:rPr>
+          <w:rFonts w:ascii="Arial" w:hAnsi="Arial" w:cs="Arial"/>
+        </w:rPr>
         <w:t xml:space="preserve">Comportement, </w:t>
       </w:r>
-      <w:proofErr w:type="spellStart"/>
-      <w:r>
-        <w:t>requetes</w:t>
-      </w:r>
-      <w:proofErr w:type="spellEnd"/>
-      <w:r>
+      <w:r>
+        <w:rPr>
+          <w:rFonts w:ascii="Arial" w:hAnsi="Arial" w:cs="Arial"/>
+        </w:rPr>
+        <w:t>requêtes</w:t>
+      </w:r>
+      <w:r>
+        <w:rPr>
+          <w:rFonts w:ascii="Arial" w:hAnsi="Arial" w:cs="Arial"/>
+        </w:rPr>
         <w:t xml:space="preserve">, création de fichiers, </w:t>
       </w:r>
-      <w:proofErr w:type="spellStart"/>
-      <w:r>
-        <w:t>persistence</w:t>
-      </w:r>
-      <w:proofErr w:type="spellEnd"/>
-      <w:r>
+      <w:r>
+        <w:rPr>
+          <w:rFonts w:ascii="Arial" w:hAnsi="Arial" w:cs="Arial"/>
+        </w:rPr>
+        <w:t>persistance</w:t>
+      </w:r>
+      <w:r>
+        <w:rPr>
+          <w:rFonts w:ascii="Arial" w:hAnsi="Arial" w:cs="Arial"/>
+        </w:rPr>
         <w:t xml:space="preserve">, chiffrement, etc… </w:t>
       </w:r>
     </w:p>
-    <w:p/>
+    <w:p>
+      <w:pPr>
+        <w:rPr>
+          <w:rFonts w:ascii="Arial" w:hAnsi="Arial" w:cs="Arial"/>
+        </w:rPr>
+      </w:pPr>
+    </w:p>
     <w:p>
       <w:pPr>
         <w:pStyle w:val="TITREII"/>
-      </w:pPr>
-      <w:r>
+        <w:rPr>
+          <w:rFonts w:ascii="Arial" w:hAnsi="Arial" w:cs="Arial"/>
+        </w:rPr>
+      </w:pPr>
+      <w:r>
+        <w:rPr>
+          <w:rFonts w:ascii="Arial" w:hAnsi="Arial" w:cs="Arial"/>
+        </w:rPr>
         <w:t>Mesures défensives</w:t>
       </w:r>
     </w:p>
     <w:p>
       <w:pPr>
         <w:pStyle w:val="TITREIII"/>
-      </w:pPr>
-      <w:proofErr w:type="spellStart"/>
-      <w:r>
-        <w:t>IOCs</w:t>
-      </w:r>
-      <w:proofErr w:type="spellEnd"/>
-      <w:r>
-        <w:t xml:space="preserve"> et détection</w:t>
-      </w:r>
-    </w:p>
-    <w:p/>
+        <w:rPr>
+          <w:rFonts w:ascii="Arial" w:hAnsi="Arial" w:cs="Arial"/>
+        </w:rPr>
+      </w:pPr>
+      <w:r>
+        <w:rPr>
+          <w:rFonts w:ascii="Arial" w:hAnsi="Arial" w:cs="Arial"/>
+        </w:rPr>
+        <w:t>IOCs et détection</w:t>
+      </w:r>
+    </w:p>
+    <w:p>
+      <w:pPr>
+        <w:rPr>
+          <w:rFonts w:ascii="Arial" w:hAnsi="Arial" w:cs="Arial"/>
+        </w:rPr>
+      </w:pPr>
+      <w:r>
+        <w:rPr>
+          <w:rFonts w:ascii="Arial" w:hAnsi="Arial" w:cs="Arial"/>
+        </w:rPr>
+        <w:t>On peut constater, après lancement du script la présence de répertoires suspicieux dans le ~/.ssh donc on peut détecter la présence ou le changement de ce répertoire avec un durcissement linux.</w:t>
+      </w:r>
+    </w:p>
+    <w:p>
+      <w:pPr>
+        <w:rPr>
+          <w:rFonts w:ascii="Arial" w:hAnsi="Arial" w:cs="Arial"/>
+        </w:rPr>
+      </w:pPr>
+      <w:r>
+        <w:rPr>
+          <w:rFonts w:ascii="Arial" w:hAnsi="Arial" w:cs="Arial"/>
+        </w:rPr>
+        <w:lastRenderedPageBreak/>
+        <w:t>On peut aussi faire une analyse de port et voir qu’on a des connexions vers un ip étrangère.</w:t>
+      </w:r>
+    </w:p>
     <w:p>
       <w:pPr>
         <w:pStyle w:val="TITREIII"/>
-      </w:pPr>
-      <w:r>
+        <w:rPr>
+          <w:rFonts w:ascii="Arial" w:hAnsi="Arial" w:cs="Arial"/>
+        </w:rPr>
+      </w:pPr>
+      <w:r>
+        <w:rPr>
+          <w:rFonts w:ascii="Arial" w:hAnsi="Arial" w:cs="Arial"/>
+        </w:rPr>
         <w:t>Nettoyage</w:t>
       </w:r>
     </w:p>
-    <w:p/>
+    <w:p>
+      <w:pPr>
+        <w:rPr>
+          <w:rFonts w:ascii="Arial" w:hAnsi="Arial" w:cs="Arial"/>
+        </w:rPr>
+      </w:pPr>
+      <w:r>
+        <w:rPr>
+          <w:rFonts w:ascii="Arial" w:hAnsi="Arial" w:cs="Arial"/>
+        </w:rPr>
+        <w:t xml:space="preserve">Pour nettoyer il faut kill -9 la racine du malware ou le processus qui créée les enfants et supprimer le répertoire suspect dans ~/.ssh </w:t>
+      </w:r>
+    </w:p>
     <w:p>
       <w:pPr>
         <w:pStyle w:val="TITREIII"/>
-      </w:pPr>
-      <w:r>
+        <w:rPr>
+          <w:rFonts w:ascii="Arial" w:hAnsi="Arial" w:cs="Arial"/>
+        </w:rPr>
+      </w:pPr>
+      <w:r>
+        <w:rPr>
+          <w:rFonts w:ascii="Arial" w:hAnsi="Arial" w:cs="Arial"/>
+        </w:rPr>
         <w:t>Mesures de protection à implémenter</w:t>
       </w:r>
     </w:p>
-    <w:p/>
+    <w:p>
+      <w:pPr>
+        <w:rPr>
+          <w:rFonts w:ascii="Arial" w:hAnsi="Arial" w:cs="Arial"/>
+        </w:rPr>
+      </w:pPr>
+      <w:r>
+        <w:rPr>
+          <w:rFonts w:ascii="Arial" w:hAnsi="Arial" w:cs="Arial"/>
+        </w:rPr>
+        <w:t>Je pense qu’une des premières mesures à implémenter serait de rendre le répertoire ssh non modifiable pas un compte user, seulement un compte administrateur ou root.</w:t>
+      </w:r>
+    </w:p>
+    <w:p>
+      <w:pPr>
+        <w:rPr>
+          <w:rFonts w:ascii="Arial" w:hAnsi="Arial" w:cs="Arial"/>
+        </w:rPr>
+      </w:pPr>
+    </w:p>
     <w:p>
       <w:pPr>
         <w:pStyle w:val="TITREII"/>
-      </w:pPr>
-      <w:r>
+        <w:rPr>
+          <w:rFonts w:ascii="Arial" w:hAnsi="Arial" w:cs="Arial"/>
+        </w:rPr>
+      </w:pPr>
+      <w:r>
+        <w:rPr>
+          <w:rFonts w:ascii="Arial" w:hAnsi="Arial" w:cs="Arial"/>
+        </w:rPr>
         <w:t>Difficultés rencontrées (hors RP)</w:t>
       </w:r>
     </w:p>
     <w:p>
-      <w:r>
+      <w:pPr>
+        <w:rPr>
+          <w:rFonts w:ascii="Arial" w:hAnsi="Arial" w:cs="Arial"/>
+        </w:rPr>
+      </w:pPr>
+      <w:r>
+        <w:rPr>
+          <w:rFonts w:ascii="Arial" w:hAnsi="Arial" w:cs="Arial"/>
+        </w:rPr>
         <w:t>Mettez ici les difficultés techniques ayant impacté le déroulement du TP noté, incluant une estimation du temps perdu et des preuves (capture, etc.).</w:t>
       </w:r>
     </w:p>
-    <w:p/>
+    <w:p>
+      <w:pPr>
+        <w:rPr>
+          <w:rFonts w:ascii="Arial" w:hAnsi="Arial" w:cs="Arial"/>
+        </w:rPr>
+      </w:pPr>
+    </w:p>
     <w:sectPr>
       <w:pgSz w:w="11906" w:h="16838"/>
       <w:pgMar w:top="720" w:right="720" w:bottom="720" w:left="720" w:header="720" w:footer="720" w:gutter="0"/>
@@ -148,6 +1770,163 @@
     </w:sectPr>
   </w:body>
 </w:document>
+</file>
+
+<file path=word/numbering.xml><?xml version="1.0" encoding="utf-8"?>
+<w:numbering xmlns:wpc="http://schemas.microsoft.com/office/word/2010/wordprocessingCanvas" xmlns:cx="http://schemas.microsoft.com/office/drawing/2014/chartex" xmlns:cx1="http://schemas.microsoft.com/office/drawing/2015/9/8/chartex" xmlns:cx2="http://schemas.microsoft.com/office/drawing/2015/10/21/chartex" xmlns:cx3="http://schemas.microsoft.com/office/drawing/2016/5/9/chartex" xmlns:cx4="http://schemas.microsoft.com/office/drawing/2016/5/10/chartex" xmlns:cx5="http://schemas.microsoft.com/office/drawing/2016/5/11/chartex" xmlns:cx6="http://schemas.microsoft.com/office/drawing/2016/5/12/chartex" xmlns:cx7="http://schemas.microsoft.com/office/drawing/2016/5/13/chartex" xmlns:cx8="http://schemas.microsoft.com/office/drawing/2016/5/14/chartex" xmlns:mc="http://schemas.openxmlformats.org/markup-compatibility/2006" xmlns:aink="http://schemas.microsoft.com/office/drawing/2016/ink" xmlns:am3d="http://schemas.microsoft.com/office/drawing/2017/model3d" xmlns:o="urn:schemas-microsoft-com:office:office" xmlns:oel="http://schemas.microsoft.com/office/2019/extlst" xmlns:r="http://schemas.openxmlformats.org/officeDocument/2006/relationships" xmlns:m="http://schemas.openxmlformats.org/officeDocument/2006/math" xmlns:v="urn:schemas-microsoft-com:vml" xmlns:wp14="http://schemas.microsoft.com/office/word/2010/wordprocessingDrawing" xmlns:wp="http://schemas.openxmlformats.org/drawingml/2006/wordprocessingDrawing" xmlns:w10="urn:schemas-microsoft-com:office:word" xmlns:w="http://schemas.openxmlformats.org/wordprocessingml/2006/main" xmlns:w14="http://schemas.microsoft.com/office/word/2010/wordml" xmlns:w15="http://schemas.microsoft.com/office/word/2012/wordml" xmlns:w16cex="http://schemas.microsoft.com/office/word/2018/wordml/cex" xmlns:w16cid="http://schemas.microsoft.com/office/word/2016/wordml/cid" xmlns:w16="http://schemas.microsoft.com/office/word/2018/wordml" xmlns:w16du="http://schemas.microsoft.com/office/word/2023/wordml/word16du" xmlns:w16sdtdh="http://schemas.microsoft.com/office/word/2020/wordml/sdtdatahash" xmlns:w16sdtfl="http://schemas.microsoft.com/office/word/2024/wordml/sdtformatlock" xmlns:w16se="http://schemas.microsoft.com/office/word/2015/wordml/symex" xmlns:wpg="http://schemas.microsoft.com/office/word/2010/wordprocessingGroup" xmlns:wpi="http://schemas.microsoft.com/office/word/2010/wordprocessingInk" xmlns:wne="http://schemas.microsoft.com/office/word/2006/wordml" xmlns:wps="http://schemas.microsoft.com/office/word/2010/wordprocessingShape" mc:Ignorable="w14 w15 w16se w16cid w16 w16cex w16sdtdh w16sdtfl w16du wp14">
+  <w:abstractNum w:abstractNumId="0" w15:restartNumberingAfterBreak="0">
+    <w:nsid w:val="4B7E5D77"/>
+    <w:multiLevelType w:val="multilevel"/>
+    <w:tmpl w:val="F6EC6DA0"/>
+    <w:lvl w:ilvl="0">
+      <w:start w:val="1"/>
+      <w:numFmt w:val="bullet"/>
+      <w:lvlText w:val=""/>
+      <w:lvlJc w:val="left"/>
+      <w:pPr>
+        <w:tabs>
+          <w:tab w:val="num" w:pos="720"/>
+        </w:tabs>
+        <w:ind w:left="720" w:hanging="360"/>
+      </w:pPr>
+      <w:rPr>
+        <w:rFonts w:ascii="Symbol" w:hAnsi="Symbol" w:hint="default"/>
+        <w:sz w:val="20"/>
+      </w:rPr>
+    </w:lvl>
+    <w:lvl w:ilvl="1" w:tentative="1">
+      <w:start w:val="1"/>
+      <w:numFmt w:val="bullet"/>
+      <w:lvlText w:val="o"/>
+      <w:lvlJc w:val="left"/>
+      <w:pPr>
+        <w:tabs>
+          <w:tab w:val="num" w:pos="1440"/>
+        </w:tabs>
+        <w:ind w:left="1440" w:hanging="360"/>
+      </w:pPr>
+      <w:rPr>
+        <w:rFonts w:ascii="Courier New" w:hAnsi="Courier New" w:hint="default"/>
+        <w:sz w:val="20"/>
+      </w:rPr>
+    </w:lvl>
+    <w:lvl w:ilvl="2" w:tentative="1">
+      <w:start w:val="1"/>
+      <w:numFmt w:val="bullet"/>
+      <w:lvlText w:val=""/>
+      <w:lvlJc w:val="left"/>
+      <w:pPr>
+        <w:tabs>
+          <w:tab w:val="num" w:pos="2160"/>
+        </w:tabs>
+        <w:ind w:left="2160" w:hanging="360"/>
+      </w:pPr>
+      <w:rPr>
+        <w:rFonts w:ascii="Wingdings" w:hAnsi="Wingdings" w:hint="default"/>
+        <w:sz w:val="20"/>
+      </w:rPr>
+    </w:lvl>
+    <w:lvl w:ilvl="3" w:tentative="1">
+      <w:start w:val="1"/>
+      <w:numFmt w:val="bullet"/>
+      <w:lvlText w:val=""/>
+      <w:lvlJc w:val="left"/>
+      <w:pPr>
+        <w:tabs>
+          <w:tab w:val="num" w:pos="2880"/>
+        </w:tabs>
+        <w:ind w:left="2880" w:hanging="360"/>
+      </w:pPr>
+      <w:rPr>
+        <w:rFonts w:ascii="Wingdings" w:hAnsi="Wingdings" w:hint="default"/>
+        <w:sz w:val="20"/>
+      </w:rPr>
+    </w:lvl>
+    <w:lvl w:ilvl="4" w:tentative="1">
+      <w:start w:val="1"/>
+      <w:numFmt w:val="bullet"/>
+      <w:lvlText w:val=""/>
+      <w:lvlJc w:val="left"/>
+      <w:pPr>
+        <w:tabs>
+          <w:tab w:val="num" w:pos="3600"/>
+        </w:tabs>
+        <w:ind w:left="3600" w:hanging="360"/>
+      </w:pPr>
+      <w:rPr>
+        <w:rFonts w:ascii="Wingdings" w:hAnsi="Wingdings" w:hint="default"/>
+        <w:sz w:val="20"/>
+      </w:rPr>
+    </w:lvl>
+    <w:lvl w:ilvl="5" w:tentative="1">
+      <w:start w:val="1"/>
+      <w:numFmt w:val="bullet"/>
+      <w:lvlText w:val=""/>
+      <w:lvlJc w:val="left"/>
+      <w:pPr>
+        <w:tabs>
+          <w:tab w:val="num" w:pos="4320"/>
+        </w:tabs>
+        <w:ind w:left="4320" w:hanging="360"/>
+      </w:pPr>
+      <w:rPr>
+        <w:rFonts w:ascii="Wingdings" w:hAnsi="Wingdings" w:hint="default"/>
+        <w:sz w:val="20"/>
+      </w:rPr>
+    </w:lvl>
+    <w:lvl w:ilvl="6" w:tentative="1">
+      <w:start w:val="1"/>
+      <w:numFmt w:val="bullet"/>
+      <w:lvlText w:val=""/>
+      <w:lvlJc w:val="left"/>
+      <w:pPr>
+        <w:tabs>
+          <w:tab w:val="num" w:pos="5040"/>
+        </w:tabs>
+        <w:ind w:left="5040" w:hanging="360"/>
+      </w:pPr>
+      <w:rPr>
+        <w:rFonts w:ascii="Wingdings" w:hAnsi="Wingdings" w:hint="default"/>
+        <w:sz w:val="20"/>
+      </w:rPr>
+    </w:lvl>
+    <w:lvl w:ilvl="7" w:tentative="1">
+      <w:start w:val="1"/>
+      <w:numFmt w:val="bullet"/>
+      <w:lvlText w:val=""/>
+      <w:lvlJc w:val="left"/>
+      <w:pPr>
+        <w:tabs>
+          <w:tab w:val="num" w:pos="5760"/>
+        </w:tabs>
+        <w:ind w:left="5760" w:hanging="360"/>
+      </w:pPr>
+      <w:rPr>
+        <w:rFonts w:ascii="Wingdings" w:hAnsi="Wingdings" w:hint="default"/>
+        <w:sz w:val="20"/>
+      </w:rPr>
+    </w:lvl>
+    <w:lvl w:ilvl="8" w:tentative="1">
+      <w:start w:val="1"/>
+      <w:numFmt w:val="bullet"/>
+      <w:lvlText w:val=""/>
+      <w:lvlJc w:val="left"/>
+      <w:pPr>
+        <w:tabs>
+          <w:tab w:val="num" w:pos="6480"/>
+        </w:tabs>
+        <w:ind w:left="6480" w:hanging="360"/>
+      </w:pPr>
+      <w:rPr>
+        <w:rFonts w:ascii="Wingdings" w:hAnsi="Wingdings" w:hint="default"/>
+        <w:sz w:val="20"/>
+      </w:rPr>
+    </w:lvl>
+  </w:abstractNum>
+  <w:num w:numId="1" w16cid:durableId="113600697">
+    <w:abstractNumId w:val="0"/>
+  </w:num>
+</w:numbering>
 </file>
 
 <file path=word/styles.xml><?xml version="1.0" encoding="utf-8"?>
@@ -805,7 +2584,6 @@
   <w:style w:type="character" w:default="1" w:styleId="DefaultParagraphFont">
     <w:name w:val="Default Paragraph Font"/>
     <w:uiPriority w:val="1"/>
-    <w:semiHidden/>
     <w:unhideWhenUsed/>
   </w:style>
   <w:style w:type="table" w:default="1" w:styleId="TableNormal">
@@ -1229,6 +3007,29 @@
       <w:szCs w:val="20"/>
       <w:lang w:val="fr-FR" w:eastAsia="ja-JP"/>
       <w14:ligatures w14:val="none"/>
+    </w:rPr>
+  </w:style>
+  <w:style w:type="character" w:styleId="Hyperlink">
+    <w:name w:val="Hyperlink"/>
+    <w:basedOn w:val="DefaultParagraphFont"/>
+    <w:uiPriority w:val="99"/>
+    <w:unhideWhenUsed/>
+    <w:rsid w:val="00B6759A"/>
+    <w:rPr>
+      <w:color w:val="467886" w:themeColor="hyperlink"/>
+      <w:u w:val="single"/>
+    </w:rPr>
+  </w:style>
+  <w:style w:type="character" w:styleId="UnresolvedMention">
+    <w:name w:val="Unresolved Mention"/>
+    <w:basedOn w:val="DefaultParagraphFont"/>
+    <w:uiPriority w:val="99"/>
+    <w:semiHidden/>
+    <w:unhideWhenUsed/>
+    <w:rsid w:val="00B6759A"/>
+    <w:rPr>
+      <w:color w:val="605E5C"/>
+      <w:shd w:val="clear" w:color="auto" w:fill="E1DFDD"/>
     </w:rPr>
   </w:style>
 </w:styles>

</xml_diff>